<commit_message>
Update all 4 ID card templates (text size adjustments)
</commit_message>
<xml_diff>
--- a/templates/idtemp1.docx
+++ b/templates/idtemp1.docx
@@ -409,15 +409,15 @@
                               <w:jc w:val="center"/>
                               <w:rPr>
                                 <w:spacing w:val="-4"/>
-                                <w:sz w:val="14"/>
-                                <w:szCs w:val="14"/>
+                                <w:sz w:val="16"/>
+                                <w:szCs w:val="16"/>
                               </w:rPr>
                             </w:pPr>
                             <w:r>
                               <w:rPr>
                                 <w:spacing w:val="-4"/>
-                                <w:sz w:val="14"/>
-                                <w:szCs w:val="14"/>
+                                <w:sz w:val="16"/>
+                                <w:szCs w:val="16"/>
                               </w:rPr>
                               <w:t xml:space="preserve">Contact </w:t>
                             </w:r>
@@ -425,8 +425,8 @@
                             <w:r>
                               <w:rPr>
                                 <w:spacing w:val="-4"/>
-                                <w:sz w:val="14"/>
-                                <w:szCs w:val="14"/>
+                                <w:sz w:val="16"/>
+                                <w:szCs w:val="16"/>
                               </w:rPr>
                               <w:t>No. :</w:t>
                             </w:r>
@@ -434,8 +434,8 @@
                             <w:r>
                               <w:rPr>
                                 <w:spacing w:val="-4"/>
-                                <w:sz w:val="14"/>
-                                <w:szCs w:val="14"/>
+                                <w:sz w:val="16"/>
+                                <w:szCs w:val="16"/>
                               </w:rPr>
                               <w:t xml:space="preserve"> {{CONTACT}}</w:t>
                             </w:r>
@@ -467,15 +467,15 @@
                         <w:jc w:val="center"/>
                         <w:rPr>
                           <w:spacing w:val="-4"/>
-                          <w:sz w:val="14"/>
-                          <w:szCs w:val="14"/>
+                          <w:sz w:val="16"/>
+                          <w:szCs w:val="16"/>
                         </w:rPr>
                       </w:pPr>
                       <w:r>
                         <w:rPr>
                           <w:spacing w:val="-4"/>
-                          <w:sz w:val="14"/>
-                          <w:szCs w:val="14"/>
+                          <w:sz w:val="16"/>
+                          <w:szCs w:val="16"/>
                         </w:rPr>
                         <w:t xml:space="preserve">Contact </w:t>
                       </w:r>
@@ -483,8 +483,8 @@
                       <w:r>
                         <w:rPr>
                           <w:spacing w:val="-4"/>
-                          <w:sz w:val="14"/>
-                          <w:szCs w:val="14"/>
+                          <w:sz w:val="16"/>
+                          <w:szCs w:val="16"/>
                         </w:rPr>
                         <w:t>No. :</w:t>
                       </w:r>
@@ -492,8 +492,8 @@
                       <w:r>
                         <w:rPr>
                           <w:spacing w:val="-4"/>
-                          <w:sz w:val="14"/>
-                          <w:szCs w:val="14"/>
+                          <w:sz w:val="16"/>
+                          <w:szCs w:val="16"/>
                         </w:rPr>
                         <w:t xml:space="preserve"> {{CONTACT}}</w:t>
                       </w:r>
@@ -557,15 +557,15 @@
                               <w:jc w:val="center"/>
                               <w:rPr>
                                 <w:spacing w:val="6"/>
-                                <w:sz w:val="14"/>
-                                <w:szCs w:val="14"/>
+                                <w:sz w:val="16"/>
+                                <w:szCs w:val="16"/>
                               </w:rPr>
                             </w:pPr>
                             <w:r>
                               <w:rPr>
                                 <w:spacing w:val="6"/>
-                                <w:sz w:val="14"/>
-                                <w:szCs w:val="14"/>
+                                <w:sz w:val="16"/>
+                                <w:szCs w:val="16"/>
                               </w:rPr>
                               <w:t>Sex: {{SEX}}</w:t>
                             </w:r>
@@ -589,7 +589,7 @@
           </mc:Choice>
           <mc:Fallback>
             <w:pict>
-              <v:shape w14:anchorId="2647D407" id="_x0000_s1030" type="#_x0000_t202" style="position:absolute;margin-left:400.7pt;margin-top:48.95pt;width:320.35pt;height:9.15pt;z-index:251669504;visibility:visible;mso-wrap-style:square;mso-width-percent:0;mso-height-percent:0;mso-wrap-distance-left:9pt;mso-wrap-distance-top:3.6pt;mso-wrap-distance-right:9pt;mso-wrap-distance-bottom:3.6pt;mso-position-horizontal:absolute;mso-position-horizontal-relative:text;mso-position-vertical:absolute;mso-position-vertical-relative:text;mso-width-percent:0;mso-height-percent:0;mso-width-relative:margin;mso-height-relative:margin;v-text-anchor:top" o:gfxdata="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" filled="f" stroked="f">
+              <v:shape w14:anchorId="2647D407" id="_x0000_s1029" type="#_x0000_t202" style="position:absolute;margin-left:400.7pt;margin-top:48.95pt;width:320.35pt;height:9.15pt;z-index:251669504;visibility:visible;mso-wrap-style:square;mso-width-percent:0;mso-height-percent:0;mso-wrap-distance-left:9pt;mso-wrap-distance-top:3.6pt;mso-wrap-distance-right:9pt;mso-wrap-distance-bottom:3.6pt;mso-position-horizontal:absolute;mso-position-horizontal-relative:text;mso-position-vertical:absolute;mso-position-vertical-relative:text;mso-width-percent:0;mso-height-percent:0;mso-width-relative:margin;mso-height-relative:margin;v-text-anchor:top" o:gfxdata="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" filled="f" stroked="f">
                 <v:textbox inset="0,0,0,0">
                   <w:txbxContent>
                     <w:p>
@@ -597,15 +597,15 @@
                         <w:jc w:val="center"/>
                         <w:rPr>
                           <w:spacing w:val="6"/>
-                          <w:sz w:val="14"/>
-                          <w:szCs w:val="14"/>
+                          <w:sz w:val="16"/>
+                          <w:szCs w:val="16"/>
                         </w:rPr>
                       </w:pPr>
                       <w:r>
                         <w:rPr>
                           <w:spacing w:val="6"/>
-                          <w:sz w:val="14"/>
-                          <w:szCs w:val="14"/>
+                          <w:sz w:val="16"/>
+                          <w:szCs w:val="16"/>
                         </w:rPr>
                         <w:t>Sex: {{SEX}}</w:t>
                       </w:r>
@@ -669,15 +669,15 @@
                               <w:jc w:val="center"/>
                               <w:rPr>
                                 <w:spacing w:val="6"/>
-                                <w:sz w:val="14"/>
-                                <w:szCs w:val="14"/>
+                                <w:sz w:val="16"/>
+                                <w:szCs w:val="16"/>
                               </w:rPr>
                             </w:pPr>
                             <w:r>
                               <w:rPr>
                                 <w:spacing w:val="6"/>
-                                <w:sz w:val="14"/>
-                                <w:szCs w:val="14"/>
+                                <w:sz w:val="16"/>
+                                <w:szCs w:val="16"/>
                               </w:rPr>
                               <w:t>Birthday: {{BIRTHDAY}}</w:t>
                             </w:r>
@@ -685,8 +685,8 @@
                               <w:rPr>
                                 <w:noProof/>
                                 <w:spacing w:val="6"/>
-                                <w:sz w:val="14"/>
-                                <w:szCs w:val="14"/>
+                                <w:sz w:val="16"/>
+                                <w:szCs w:val="16"/>
                               </w:rPr>
                               <w:drawing>
                                 <wp:inline distT="0" distB="0" distL="0" distR="0" wp14:anchorId="3EEF1DD2" wp14:editId="0616ACFE">
@@ -740,8 +740,8 @@
                             <w:r>
                               <w:rPr>
                                 <w:spacing w:val="6"/>
-                                <w:sz w:val="14"/>
-                                <w:szCs w:val="14"/>
+                                <w:sz w:val="16"/>
+                                <w:szCs w:val="16"/>
                               </w:rPr>
                               <w:t>}}</w:t>
                             </w:r>
@@ -765,7 +765,7 @@
           </mc:Choice>
           <mc:Fallback>
             <w:pict>
-              <v:shape w14:anchorId="0C6C78B9" id="_x0000_s1031" type="#_x0000_t202" style="position:absolute;margin-left:401.25pt;margin-top:57.85pt;width:320.35pt;height:9.15pt;z-index:251671552;visibility:visible;mso-wrap-style:square;mso-width-percent:0;mso-height-percent:0;mso-wrap-distance-left:9pt;mso-wrap-distance-top:3.6pt;mso-wrap-distance-right:9pt;mso-wrap-distance-bottom:3.6pt;mso-position-horizontal:absolute;mso-position-horizontal-relative:text;mso-position-vertical:absolute;mso-position-vertical-relative:text;mso-width-percent:0;mso-height-percent:0;mso-width-relative:margin;mso-height-relative:margin;v-text-anchor:top" o:gfxdata="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" filled="f" stroked="f">
+              <v:shape w14:anchorId="0C6C78B9" id="_x0000_s1030" type="#_x0000_t202" style="position:absolute;margin-left:401.25pt;margin-top:57.85pt;width:320.35pt;height:9.15pt;z-index:251671552;visibility:visible;mso-wrap-style:square;mso-width-percent:0;mso-height-percent:0;mso-wrap-distance-left:9pt;mso-wrap-distance-top:3.6pt;mso-wrap-distance-right:9pt;mso-wrap-distance-bottom:3.6pt;mso-position-horizontal:absolute;mso-position-horizontal-relative:text;mso-position-vertical:absolute;mso-position-vertical-relative:text;mso-width-percent:0;mso-height-percent:0;mso-width-relative:margin;mso-height-relative:margin;v-text-anchor:top" o:gfxdata="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" filled="f" stroked="f">
                 <v:textbox inset="0,0,0,0">
                   <w:txbxContent>
                     <w:p>
@@ -773,15 +773,15 @@
                         <w:jc w:val="center"/>
                         <w:rPr>
                           <w:spacing w:val="6"/>
-                          <w:sz w:val="14"/>
-                          <w:szCs w:val="14"/>
+                          <w:sz w:val="16"/>
+                          <w:szCs w:val="16"/>
                         </w:rPr>
                       </w:pPr>
                       <w:r>
                         <w:rPr>
                           <w:spacing w:val="6"/>
-                          <w:sz w:val="14"/>
-                          <w:szCs w:val="14"/>
+                          <w:sz w:val="16"/>
+                          <w:szCs w:val="16"/>
                         </w:rPr>
                         <w:t>Birthday: {{BIRTHDAY}}</w:t>
                       </w:r>
@@ -789,8 +789,8 @@
                         <w:rPr>
                           <w:noProof/>
                           <w:spacing w:val="6"/>
-                          <w:sz w:val="14"/>
-                          <w:szCs w:val="14"/>
+                          <w:sz w:val="16"/>
+                          <w:szCs w:val="16"/>
                         </w:rPr>
                         <w:drawing>
                           <wp:inline distT="0" distB="0" distL="0" distR="0" wp14:anchorId="3EEF1DD2" wp14:editId="0616ACFE">
@@ -810,7 +810,7 @@
                                     </pic:cNvPicPr>
                                   </pic:nvPicPr>
                                   <pic:blipFill>
-                                    <a:blip r:embed="rId7">
+                                    <a:blip r:embed="rId6">
                                       <a:extLst>
                                         <a:ext uri="{28A0092B-C50C-407E-A947-70E740481C1C}">
                                           <a14:useLocalDpi xmlns:a14="http://schemas.microsoft.com/office/drawing/2010/main" val="0"/>
@@ -844,8 +844,8 @@
                       <w:r>
                         <w:rPr>
                           <w:spacing w:val="6"/>
-                          <w:sz w:val="14"/>
-                          <w:szCs w:val="14"/>
+                          <w:sz w:val="16"/>
+                          <w:szCs w:val="16"/>
                         </w:rPr>
                         <w:t>}}</w:t>
                       </w:r>
@@ -909,23 +909,23 @@
                               <w:jc w:val="center"/>
                               <w:rPr>
                                 <w:spacing w:val="6"/>
-                                <w:sz w:val="14"/>
-                                <w:szCs w:val="14"/>
+                                <w:sz w:val="16"/>
+                                <w:szCs w:val="16"/>
                               </w:rPr>
                             </w:pPr>
                             <w:r>
                               <w:rPr>
                                 <w:spacing w:val="6"/>
-                                <w:sz w:val="14"/>
-                                <w:szCs w:val="14"/>
+                                <w:sz w:val="16"/>
+                                <w:szCs w:val="16"/>
                               </w:rPr>
                               <w:t xml:space="preserve">Address: </w:t>
                             </w:r>
                             <w:r>
                               <w:rPr>
                                 <w:spacing w:val="6"/>
-                                <w:sz w:val="14"/>
-                                <w:szCs w:val="14"/>
+                                <w:sz w:val="16"/>
+                                <w:szCs w:val="16"/>
                               </w:rPr>
                               <w:t>{{ADDRESS}}</w:t>
                             </w:r>
@@ -949,7 +949,7 @@
           </mc:Choice>
           <mc:Fallback>
             <w:pict>
-              <v:shape w14:anchorId="52D9BCB2" id="_x0000_s1032" type="#_x0000_t202" style="position:absolute;margin-left:400.45pt;margin-top:40.25pt;width:320.35pt;height:9.15pt;z-index:251667456;visibility:visible;mso-wrap-style:square;mso-width-percent:0;mso-height-percent:0;mso-wrap-distance-left:9pt;mso-wrap-distance-top:3.6pt;mso-wrap-distance-right:9pt;mso-wrap-distance-bottom:3.6pt;mso-position-horizontal:absolute;mso-position-horizontal-relative:text;mso-position-vertical:absolute;mso-position-vertical-relative:text;mso-width-percent:0;mso-height-percent:0;mso-width-relative:margin;mso-height-relative:margin;v-text-anchor:top" o:gfxdata="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" filled="f" stroked="f">
+              <v:shape w14:anchorId="52D9BCB2" id="_x0000_s1031" type="#_x0000_t202" style="position:absolute;margin-left:400.45pt;margin-top:40.25pt;width:320.35pt;height:9.15pt;z-index:251667456;visibility:visible;mso-wrap-style:square;mso-width-percent:0;mso-height-percent:0;mso-wrap-distance-left:9pt;mso-wrap-distance-top:3.6pt;mso-wrap-distance-right:9pt;mso-wrap-distance-bottom:3.6pt;mso-position-horizontal:absolute;mso-position-horizontal-relative:text;mso-position-vertical:absolute;mso-position-vertical-relative:text;mso-width-percent:0;mso-height-percent:0;mso-width-relative:margin;mso-height-relative:margin;v-text-anchor:top" o:gfxdata="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" filled="f" stroked="f">
                 <v:textbox inset="0,0,0,0">
                   <w:txbxContent>
                     <w:p>
@@ -957,23 +957,23 @@
                         <w:jc w:val="center"/>
                         <w:rPr>
                           <w:spacing w:val="6"/>
-                          <w:sz w:val="14"/>
-                          <w:szCs w:val="14"/>
+                          <w:sz w:val="16"/>
+                          <w:szCs w:val="16"/>
                         </w:rPr>
                       </w:pPr>
                       <w:r>
                         <w:rPr>
                           <w:spacing w:val="6"/>
-                          <w:sz w:val="14"/>
-                          <w:szCs w:val="14"/>
+                          <w:sz w:val="16"/>
+                          <w:szCs w:val="16"/>
                         </w:rPr>
                         <w:t xml:space="preserve">Address: </w:t>
                       </w:r>
                       <w:r>
                         <w:rPr>
                           <w:spacing w:val="6"/>
-                          <w:sz w:val="14"/>
-                          <w:szCs w:val="14"/>
+                          <w:sz w:val="16"/>
+                          <w:szCs w:val="16"/>
                         </w:rPr>
                         <w:t>{{ADDRESS}}</w:t>
                       </w:r>
@@ -1113,7 +1113,7 @@
           </mc:Choice>
           <mc:Fallback>
             <w:pict>
-              <v:shape w14:anchorId="110DF417" id="_x0000_s1033" type="#_x0000_t202" style="position:absolute;margin-left:391.5pt;margin-top:23.2pt;width:335.5pt;height:21.8pt;z-index:251665408;visibility:visible;mso-wrap-style:square;mso-width-percent:0;mso-height-percent:0;mso-wrap-distance-left:9pt;mso-wrap-distance-top:3.6pt;mso-wrap-distance-right:9pt;mso-wrap-distance-bottom:3.6pt;mso-position-horizontal:absolute;mso-position-horizontal-relative:text;mso-position-vertical:absolute;mso-position-vertical-relative:text;mso-width-percent:0;mso-height-percent:0;mso-width-relative:margin;mso-height-relative:margin;v-text-anchor:top" o:gfxdata="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" filled="f" stroked="f">
+              <v:shape w14:anchorId="110DF417" id="_x0000_s1032" type="#_x0000_t202" style="position:absolute;margin-left:391.5pt;margin-top:23.2pt;width:335.5pt;height:21.8pt;z-index:251665408;visibility:visible;mso-wrap-style:square;mso-width-percent:0;mso-height-percent:0;mso-wrap-distance-left:9pt;mso-wrap-distance-top:3.6pt;mso-wrap-distance-right:9pt;mso-wrap-distance-bottom:3.6pt;mso-position-horizontal:absolute;mso-position-horizontal-relative:text;mso-position-vertical:absolute;mso-position-vertical-relative:text;mso-width-percent:0;mso-height-percent:0;mso-width-relative:margin;mso-height-relative:margin;v-text-anchor:top" o:gfxdata="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" filled="f" stroked="f">
                 <v:textbox>
                   <w:txbxContent>
                     <w:p>
@@ -1290,7 +1290,7 @@
           </mc:Choice>
           <mc:Fallback>
             <w:pict>
-              <v:shape w14:anchorId="0F622183" id="_x0000_s1034" type="#_x0000_t202" style="position:absolute;margin-left:225.4pt;margin-top:92pt;width:175.55pt;height:13.65pt;rotation:-90;z-index:251677696;visibility:visible;mso-wrap-style:square;mso-width-percent:0;mso-height-percent:0;mso-wrap-distance-left:9pt;mso-wrap-distance-top:3.6pt;mso-wrap-distance-right:9pt;mso-wrap-distance-bottom:3.6pt;mso-position-horizontal:absolute;mso-position-horizontal-relative:text;mso-position-vertical:absolute;mso-position-vertical-relative:text;mso-width-percent:0;mso-height-percent:0;mso-width-relative:margin;mso-height-relative:margin;v-text-anchor:top" o:gfxdata="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" filled="f" stroked="f">
+              <v:shape w14:anchorId="0F622183" id="_x0000_s1033" type="#_x0000_t202" style="position:absolute;margin-left:225.4pt;margin-top:92pt;width:175.55pt;height:13.65pt;rotation:-90;z-index:251677696;visibility:visible;mso-wrap-style:square;mso-width-percent:0;mso-height-percent:0;mso-wrap-distance-left:9pt;mso-wrap-distance-top:3.6pt;mso-wrap-distance-right:9pt;mso-wrap-distance-bottom:3.6pt;mso-position-horizontal:absolute;mso-position-horizontal-relative:text;mso-position-vertical:absolute;mso-position-vertical-relative:text;mso-width-percent:0;mso-height-percent:0;mso-width-relative:margin;mso-height-relative:margin;v-text-anchor:top" o:gfxdata="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" filled="f" stroked="f">
                 <v:textbox inset="0,0,0,0">
                   <w:txbxContent>
                     <w:p>
@@ -1425,7 +1425,7 @@
           </mc:Choice>
           <mc:Fallback>
             <w:pict>
-              <v:shape w14:anchorId="298364A9" id="_x0000_s1035" type="#_x0000_t202" style="position:absolute;margin-left:632.1pt;margin-top:116.25pt;width:213.05pt;height:15.35pt;rotation:-90;z-index:251679744;visibility:visible;mso-wrap-style:square;mso-width-percent:0;mso-height-percent:0;mso-wrap-distance-left:9pt;mso-wrap-distance-top:3.6pt;mso-wrap-distance-right:9pt;mso-wrap-distance-bottom:3.6pt;mso-position-horizontal:absolute;mso-position-horizontal-relative:text;mso-position-vertical:absolute;mso-position-vertical-relative:text;mso-width-percent:0;mso-height-percent:0;mso-width-relative:margin;mso-height-relative:margin;v-text-anchor:top" o:gfxdata="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" filled="f" stroked="f">
+              <v:shape w14:anchorId="298364A9" id="_x0000_s1034" type="#_x0000_t202" style="position:absolute;margin-left:632.1pt;margin-top:116.25pt;width:213.05pt;height:15.35pt;rotation:-90;z-index:251679744;visibility:visible;mso-wrap-style:square;mso-width-percent:0;mso-height-percent:0;mso-wrap-distance-left:9pt;mso-wrap-distance-top:3.6pt;mso-wrap-distance-right:9pt;mso-wrap-distance-bottom:3.6pt;mso-position-horizontal:absolute;mso-position-horizontal-relative:text;mso-position-vertical:absolute;mso-position-vertical-relative:text;mso-width-percent:0;mso-height-percent:0;mso-width-relative:margin;mso-height-relative:margin;v-text-anchor:top" o:gfxdata="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" filled="f" stroked="f">
                 <v:textbox inset="0,0,0,0">
                   <w:txbxContent>
                     <w:p>
@@ -1560,7 +1560,7 @@
           </mc:Choice>
           <mc:Fallback>
             <w:pict>
-              <v:shape w14:anchorId="3A561120" id="_x0000_s1036" type="#_x0000_t202" style="position:absolute;margin-left:-36pt;margin-top:187.25pt;width:204.35pt;height:23.25pt;z-index:251663360;visibility:visible;mso-wrap-style:square;mso-width-percent:0;mso-height-percent:0;mso-wrap-distance-left:9pt;mso-wrap-distance-top:3.6pt;mso-wrap-distance-right:9pt;mso-wrap-distance-bottom:3.6pt;mso-position-horizontal:absolute;mso-position-horizontal-relative:text;mso-position-vertical:absolute;mso-position-vertical-relative:text;mso-width-percent:0;mso-height-percent:0;mso-width-relative:margin;mso-height-relative:margin;v-text-anchor:top" o:gfxdata="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" filled="f" stroked="f">
+              <v:shape w14:anchorId="3A561120" id="_x0000_s1035" type="#_x0000_t202" style="position:absolute;margin-left:-36pt;margin-top:187.25pt;width:204.35pt;height:23.25pt;z-index:251663360;visibility:visible;mso-wrap-style:square;mso-width-percent:0;mso-height-percent:0;mso-wrap-distance-left:9pt;mso-wrap-distance-top:3.6pt;mso-wrap-distance-right:9pt;mso-wrap-distance-bottom:3.6pt;mso-position-horizontal:absolute;mso-position-horizontal-relative:text;mso-position-vertical:absolute;mso-position-vertical-relative:text;mso-width-percent:0;mso-height-percent:0;mso-width-relative:margin;mso-height-relative:margin;v-text-anchor:top" o:gfxdata="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" filled="f" stroked="f">
                 <v:textbox>
                   <w:txbxContent>
                     <w:p>

</xml_diff>